<commit_message>
Restart numbering for each numbered list in proposal document
Co-Authored-By: Claude Opus 5.5 <noreply@anthropic.com>
Claude-Session: https://claude.ai/code/session_01FNqPXaYbdGoFzQYGQwJHG2
</commit_message>
<xml_diff>
--- a/docs/Wagner_Sole_Distributor_Proposal_Bangladesh.docx
+++ b/docs/Wagner_Sole_Distributor_Proposal_Bangladesh.docx
@@ -1446,7 +1446,7 @@
         <w:pStyle w:val="ListParagraph"/>
         <w:numPr>
           <w:ilvl w:val="0"/>
-          <w:numId w:val="2"/>
+          <w:numId w:val="4"/>
         </w:numPr>
         <w:spacing w:after="80" w:line="276"/>
       </w:pPr>
@@ -1459,7 +1459,7 @@
         <w:pStyle w:val="ListParagraph"/>
         <w:numPr>
           <w:ilvl w:val="0"/>
-          <w:numId w:val="2"/>
+          <w:numId w:val="4"/>
         </w:numPr>
         <w:spacing w:after="80" w:line="276"/>
       </w:pPr>
@@ -1472,7 +1472,7 @@
         <w:pStyle w:val="ListParagraph"/>
         <w:numPr>
           <w:ilvl w:val="0"/>
-          <w:numId w:val="2"/>
+          <w:numId w:val="4"/>
         </w:numPr>
         <w:spacing w:after="80" w:line="276"/>
       </w:pPr>
@@ -1485,7 +1485,7 @@
         <w:pStyle w:val="ListParagraph"/>
         <w:numPr>
           <w:ilvl w:val="0"/>
-          <w:numId w:val="2"/>
+          <w:numId w:val="4"/>
         </w:numPr>
         <w:spacing w:after="80" w:line="276"/>
       </w:pPr>
@@ -1498,7 +1498,7 @@
         <w:pStyle w:val="ListParagraph"/>
         <w:numPr>
           <w:ilvl w:val="0"/>
-          <w:numId w:val="2"/>
+          <w:numId w:val="4"/>
         </w:numPr>
         <w:spacing w:after="80" w:line="276"/>
       </w:pPr>
@@ -2142,7 +2142,7 @@
         <w:pStyle w:val="ListParagraph"/>
         <w:numPr>
           <w:ilvl w:val="0"/>
-          <w:numId w:val="2"/>
+          <w:numId w:val="5"/>
         </w:numPr>
         <w:spacing w:after="80" w:line="276"/>
       </w:pPr>
@@ -2155,7 +2155,7 @@
         <w:pStyle w:val="ListParagraph"/>
         <w:numPr>
           <w:ilvl w:val="0"/>
-          <w:numId w:val="2"/>
+          <w:numId w:val="5"/>
         </w:numPr>
         <w:spacing w:after="80" w:line="276"/>
       </w:pPr>
@@ -2168,7 +2168,7 @@
         <w:pStyle w:val="ListParagraph"/>
         <w:numPr>
           <w:ilvl w:val="0"/>
-          <w:numId w:val="2"/>
+          <w:numId w:val="5"/>
         </w:numPr>
         <w:spacing w:after="80" w:line="276"/>
       </w:pPr>
@@ -3183,7 +3183,7 @@
         <w:pStyle w:val="ListParagraph"/>
         <w:numPr>
           <w:ilvl w:val="0"/>
-          <w:numId w:val="2"/>
+          <w:numId w:val="6"/>
         </w:numPr>
         <w:spacing w:after="80" w:line="276"/>
       </w:pPr>
@@ -3196,7 +3196,7 @@
         <w:pStyle w:val="ListParagraph"/>
         <w:numPr>
           <w:ilvl w:val="0"/>
-          <w:numId w:val="2"/>
+          <w:numId w:val="6"/>
         </w:numPr>
         <w:spacing w:after="80" w:line="276"/>
       </w:pPr>
@@ -3209,7 +3209,7 @@
         <w:pStyle w:val="ListParagraph"/>
         <w:numPr>
           <w:ilvl w:val="0"/>
-          <w:numId w:val="2"/>
+          <w:numId w:val="6"/>
         </w:numPr>
         <w:spacing w:after="80" w:line="276"/>
       </w:pPr>
@@ -3222,7 +3222,7 @@
         <w:pStyle w:val="ListParagraph"/>
         <w:numPr>
           <w:ilvl w:val="0"/>
-          <w:numId w:val="2"/>
+          <w:numId w:val="6"/>
         </w:numPr>
         <w:spacing w:after="80" w:line="276"/>
       </w:pPr>
@@ -3235,7 +3235,7 @@
         <w:pStyle w:val="ListParagraph"/>
         <w:numPr>
           <w:ilvl w:val="0"/>
-          <w:numId w:val="2"/>
+          <w:numId w:val="6"/>
         </w:numPr>
         <w:spacing w:after="80" w:line="276"/>
       </w:pPr>
@@ -3256,7 +3256,7 @@
         <w:pStyle w:val="ListParagraph"/>
         <w:numPr>
           <w:ilvl w:val="0"/>
-          <w:numId w:val="2"/>
+          <w:numId w:val="7"/>
         </w:numPr>
         <w:spacing w:after="80" w:line="276"/>
       </w:pPr>
@@ -3269,7 +3269,7 @@
         <w:pStyle w:val="ListParagraph"/>
         <w:numPr>
           <w:ilvl w:val="0"/>
-          <w:numId w:val="2"/>
+          <w:numId w:val="7"/>
         </w:numPr>
         <w:spacing w:after="80" w:line="276"/>
       </w:pPr>
@@ -3282,7 +3282,7 @@
         <w:pStyle w:val="ListParagraph"/>
         <w:numPr>
           <w:ilvl w:val="0"/>
-          <w:numId w:val="2"/>
+          <w:numId w:val="7"/>
         </w:numPr>
         <w:spacing w:after="80" w:line="276"/>
       </w:pPr>
@@ -3295,7 +3295,7 @@
         <w:pStyle w:val="ListParagraph"/>
         <w:numPr>
           <w:ilvl w:val="0"/>
-          <w:numId w:val="2"/>
+          <w:numId w:val="7"/>
         </w:numPr>
         <w:spacing w:after="80" w:line="276"/>
       </w:pPr>
@@ -3308,7 +3308,7 @@
         <w:pStyle w:val="ListParagraph"/>
         <w:numPr>
           <w:ilvl w:val="0"/>
-          <w:numId w:val="2"/>
+          <w:numId w:val="7"/>
         </w:numPr>
         <w:spacing w:after="80" w:line="276"/>
       </w:pPr>
@@ -3602,6 +3602,30 @@
   </w:num>
   <w:num w:numId="3">
     <w:abstractNumId w:val="2"/>
+    <w:lvlOverride w:ilvl="0">
+      <w:startOverride w:val="1"/>
+    </w:lvlOverride>
+  </w:num>
+  <w:num w:numId="4">
+    <w:abstractNumId w:val="3"/>
+    <w:lvlOverride w:ilvl="0">
+      <w:startOverride w:val="1"/>
+    </w:lvlOverride>
+  </w:num>
+  <w:num w:numId="5">
+    <w:abstractNumId w:val="3"/>
+    <w:lvlOverride w:ilvl="0">
+      <w:startOverride w:val="1"/>
+    </w:lvlOverride>
+  </w:num>
+  <w:num w:numId="6">
+    <w:abstractNumId w:val="3"/>
+    <w:lvlOverride w:ilvl="0">
+      <w:startOverride w:val="1"/>
+    </w:lvlOverride>
+  </w:num>
+  <w:num w:numId="7">
+    <w:abstractNumId w:val="3"/>
     <w:lvlOverride w:ilvl="0">
       <w:startOverride w:val="1"/>
     </w:lvlOverride>

</xml_diff>